<commit_message>
HTML/PDF/DOCX compatible ON/OR templates
</commit_message>
<xml_diff>
--- a/publication/shared/config/word-template.docx
+++ b/publication/shared/config/word-template.docx
@@ -2,16 +2,151 @@
 <file path=word/document.xml><?xml version="1.0" encoding="utf-8"?>
 <w:document xmlns:wpc="http://schemas.microsoft.com/office/word/2010/wordprocessingCanvas" xmlns:cx="http://schemas.microsoft.com/office/drawing/2014/chartex" xmlns:cx1="http://schemas.microsoft.com/office/drawing/2015/9/8/chartex" xmlns:cx2="http://schemas.microsoft.com/office/drawing/2015/10/21/chartex" xmlns:cx3="http://schemas.microsoft.com/office/drawing/2016/5/9/chartex" xmlns:cx4="http://schemas.microsoft.com/office/drawing/2016/5/10/chartex" xmlns:cx5="http://schemas.microsoft.com/office/drawing/2016/5/11/chartex" xmlns:cx6="http://schemas.microsoft.com/office/drawing/2016/5/12/chartex" xmlns:cx7="http://schemas.microsoft.com/office/drawing/2016/5/13/chartex" xmlns:cx8="http://schemas.microsoft.com/office/drawing/2016/5/14/chartex" xmlns:mc="http://schemas.openxmlformats.org/markup-compatibility/2006" xmlns:aink="http://schemas.microsoft.com/office/drawing/2016/ink" xmlns:am3d="http://schemas.microsoft.com/office/drawing/2017/model3d" xmlns:o="urn:schemas-microsoft-com:office:office" xmlns:oel="http://schemas.microsoft.com/office/2019/extlst" xmlns:r="http://schemas.openxmlformats.org/officeDocument/2006/relationships" xmlns:m="http://schemas.openxmlformats.org/officeDocument/2006/math" xmlns:v="urn:schemas-microsoft-com:vml" xmlns:wp14="http://schemas.microsoft.com/office/word/2010/wordprocessingDrawing" xmlns:wp="http://schemas.openxmlformats.org/drawingml/2006/wordprocessingDrawing" xmlns:w10="urn:schemas-microsoft-com:office:word" xmlns:w="http://schemas.openxmlformats.org/wordprocessingml/2006/main" xmlns:w14="http://schemas.microsoft.com/office/word/2010/wordml" xmlns:w15="http://schemas.microsoft.com/office/word/2012/wordml" xmlns:w16cex="http://schemas.microsoft.com/office/word/2018/wordml/cex" xmlns:w16cid="http://schemas.microsoft.com/office/word/2016/wordml/cid" xmlns:w16="http://schemas.microsoft.com/office/word/2018/wordml" xmlns:w16du="http://schemas.microsoft.com/office/word/2023/wordml/word16du" xmlns:w16sdtdh="http://schemas.microsoft.com/office/word/2020/wordml/sdtdatahash" xmlns:w16sdtfl="http://schemas.microsoft.com/office/word/2024/wordml/sdtformatlock" xmlns:w16se="http://schemas.microsoft.com/office/word/2015/wordml/symex" xmlns:wpg="http://schemas.microsoft.com/office/word/2010/wordprocessingGroup" xmlns:wpi="http://schemas.microsoft.com/office/word/2010/wordprocessingInk" xmlns:wne="http://schemas.microsoft.com/office/word/2006/wordml" xmlns:wps="http://schemas.microsoft.com/office/word/2010/wordprocessingShape" mc:Ignorable="w14 w15 w16se w16cid w16 w16cex w16sdtdh w16sdtfl w16du wp14">
   <w:body>
-    <w:p/>
+    <w:p>
+      <w:pPr>
+        <w:pStyle w:val="Titre"/>
+        <w:jc w:val="center"/>
+        <w:rPr>
+          <w:lang w:val="fr-FR"/>
+        </w:rPr>
+      </w:pPr>
+      <w:r>
+        <w:rPr>
+          <w:lang w:val="fr-FR"/>
+        </w:rPr>
+        <w:t>Titre</w:t>
+      </w:r>
+    </w:p>
+    <w:p>
+      <w:pPr>
+        <w:rPr>
+          <w:lang w:val="fr-FR"/>
+        </w:rPr>
+      </w:pPr>
+      <w:r>
+        <w:rPr>
+          <w:lang w:val="fr-FR"/>
+        </w:rPr>
+        <w:br w:type="page"/>
+      </w:r>
+    </w:p>
+    <w:p>
+      <w:pPr>
+        <w:rPr>
+          <w:lang w:val="fr-FR"/>
+        </w:rPr>
+      </w:pPr>
+    </w:p>
     <w:sectPr>
+      <w:footerReference w:type="default" r:id="rId9"/>
+      <w:footerReference w:type="first" r:id="rId10"/>
       <w:pgSz w:w="11906" w:h="16838"/>
       <w:pgMar w:top="1417" w:right="1417" w:bottom="1417" w:left="1417" w:header="708" w:footer="708" w:gutter="0"/>
       <w:lnNumType w:countBy="1"/>
+      <w:pgNumType w:start="0"/>
       <w:cols w:space="708"/>
+      <w:titlePg/>
       <w:docGrid w:linePitch="360"/>
     </w:sectPr>
   </w:body>
 </w:document>
+</file>
+
+<file path=word/endnotes.xml><?xml version="1.0" encoding="utf-8"?>
+<w:endnotes xmlns:wpc="http://schemas.microsoft.com/office/word/2010/wordprocessingCanvas" xmlns:cx="http://schemas.microsoft.com/office/drawing/2014/chartex" xmlns:cx1="http://schemas.microsoft.com/office/drawing/2015/9/8/chartex" xmlns:cx2="http://schemas.microsoft.com/office/drawing/2015/10/21/chartex" xmlns:cx3="http://schemas.microsoft.com/office/drawing/2016/5/9/chartex" xmlns:cx4="http://schemas.microsoft.com/office/drawing/2016/5/10/chartex" xmlns:cx5="http://schemas.microsoft.com/office/drawing/2016/5/11/chartex" xmlns:cx6="http://schemas.microsoft.com/office/drawing/2016/5/12/chartex" xmlns:cx7="http://schemas.microsoft.com/office/drawing/2016/5/13/chartex" xmlns:cx8="http://schemas.microsoft.com/office/drawing/2016/5/14/chartex" xmlns:mc="http://schemas.openxmlformats.org/markup-compatibility/2006" xmlns:aink="http://schemas.microsoft.com/office/drawing/2016/ink" xmlns:am3d="http://schemas.microsoft.com/office/drawing/2017/model3d" xmlns:o="urn:schemas-microsoft-com:office:office" xmlns:oel="http://schemas.microsoft.com/office/2019/extlst" xmlns:r="http://schemas.openxmlformats.org/officeDocument/2006/relationships" xmlns:m="http://schemas.openxmlformats.org/officeDocument/2006/math" xmlns:v="urn:schemas-microsoft-com:vml" xmlns:wp14="http://schemas.microsoft.com/office/word/2010/wordprocessingDrawing" xmlns:wp="http://schemas.openxmlformats.org/drawingml/2006/wordprocessingDrawing" xmlns:w10="urn:schemas-microsoft-com:office:word" xmlns:w="http://schemas.openxmlformats.org/wordprocessingml/2006/main" xmlns:w14="http://schemas.microsoft.com/office/word/2010/wordml" xmlns:w15="http://schemas.microsoft.com/office/word/2012/wordml" xmlns:w16cex="http://schemas.microsoft.com/office/word/2018/wordml/cex" xmlns:w16cid="http://schemas.microsoft.com/office/word/2016/wordml/cid" xmlns:w16="http://schemas.microsoft.com/office/word/2018/wordml" xmlns:w16du="http://schemas.microsoft.com/office/word/2023/wordml/word16du" xmlns:w16sdtdh="http://schemas.microsoft.com/office/word/2020/wordml/sdtdatahash" xmlns:w16sdtfl="http://schemas.microsoft.com/office/word/2024/wordml/sdtformatlock" xmlns:w16se="http://schemas.microsoft.com/office/word/2015/wordml/symex" xmlns:wpg="http://schemas.microsoft.com/office/word/2010/wordprocessingGroup" xmlns:wpi="http://schemas.microsoft.com/office/word/2010/wordprocessingInk" xmlns:wne="http://schemas.microsoft.com/office/word/2006/wordml" xmlns:wps="http://schemas.microsoft.com/office/word/2010/wordprocessingShape" mc:Ignorable="w14 w15 w16se w16cid w16 w16cex w16sdtdh w16sdtfl w16du wp14">
+  <w:endnote w:type="separator" w:id="-1">
+    <w:p>
+      <w:r>
+        <w:separator/>
+      </w:r>
+    </w:p>
+  </w:endnote>
+  <w:endnote w:type="continuationSeparator" w:id="0">
+    <w:p>
+      <w:r>
+        <w:continuationSeparator/>
+      </w:r>
+    </w:p>
+  </w:endnote>
+</w:endnotes>
+</file>
+
+<file path=word/footer1.xml><?xml version="1.0" encoding="utf-8"?>
+<w:ftr xmlns:wpc="http://schemas.microsoft.com/office/word/2010/wordprocessingCanvas" xmlns:cx="http://schemas.microsoft.com/office/drawing/2014/chartex" xmlns:cx1="http://schemas.microsoft.com/office/drawing/2015/9/8/chartex" xmlns:cx2="http://schemas.microsoft.com/office/drawing/2015/10/21/chartex" xmlns:cx3="http://schemas.microsoft.com/office/drawing/2016/5/9/chartex" xmlns:cx4="http://schemas.microsoft.com/office/drawing/2016/5/10/chartex" xmlns:cx5="http://schemas.microsoft.com/office/drawing/2016/5/11/chartex" xmlns:cx6="http://schemas.microsoft.com/office/drawing/2016/5/12/chartex" xmlns:cx7="http://schemas.microsoft.com/office/drawing/2016/5/13/chartex" xmlns:cx8="http://schemas.microsoft.com/office/drawing/2016/5/14/chartex" xmlns:mc="http://schemas.openxmlformats.org/markup-compatibility/2006" xmlns:aink="http://schemas.microsoft.com/office/drawing/2016/ink" xmlns:am3d="http://schemas.microsoft.com/office/drawing/2017/model3d" xmlns:o="urn:schemas-microsoft-com:office:office" xmlns:oel="http://schemas.microsoft.com/office/2019/extlst" xmlns:r="http://schemas.openxmlformats.org/officeDocument/2006/relationships" xmlns:m="http://schemas.openxmlformats.org/officeDocument/2006/math" xmlns:v="urn:schemas-microsoft-com:vml" xmlns:wp14="http://schemas.microsoft.com/office/word/2010/wordprocessingDrawing" xmlns:wp="http://schemas.openxmlformats.org/drawingml/2006/wordprocessingDrawing" xmlns:w10="urn:schemas-microsoft-com:office:word" xmlns:w="http://schemas.openxmlformats.org/wordprocessingml/2006/main" xmlns:w14="http://schemas.microsoft.com/office/word/2010/wordml" xmlns:w15="http://schemas.microsoft.com/office/word/2012/wordml" xmlns:w16cex="http://schemas.microsoft.com/office/word/2018/wordml/cex" xmlns:w16cid="http://schemas.microsoft.com/office/word/2016/wordml/cid" xmlns:w16="http://schemas.microsoft.com/office/word/2018/wordml" xmlns:w16du="http://schemas.microsoft.com/office/word/2023/wordml/word16du" xmlns:w16sdtdh="http://schemas.microsoft.com/office/word/2020/wordml/sdtdatahash" xmlns:w16sdtfl="http://schemas.microsoft.com/office/word/2024/wordml/sdtformatlock" xmlns:w16se="http://schemas.microsoft.com/office/word/2015/wordml/symex" xmlns:wpg="http://schemas.microsoft.com/office/word/2010/wordprocessingGroup" xmlns:wpi="http://schemas.microsoft.com/office/word/2010/wordprocessingInk" xmlns:wne="http://schemas.microsoft.com/office/word/2006/wordml" xmlns:wps="http://schemas.microsoft.com/office/word/2010/wordprocessingShape" mc:Ignorable="w14 w15 w16se w16cid w16 w16cex w16sdtdh w16sdtfl w16du wp14">
+  <w:sdt>
+    <w:sdtPr>
+      <w:id w:val="1094122047"/>
+      <w:docPartObj>
+        <w:docPartGallery w:val="Page Numbers (Bottom of Page)"/>
+        <w:docPartUnique/>
+      </w:docPartObj>
+    </w:sdtPr>
+    <w:sdtContent>
+      <w:p>
+        <w:pPr>
+          <w:pStyle w:val="Pieddepage"/>
+          <w:jc w:val="center"/>
+        </w:pPr>
+        <w:r>
+          <w:fldChar w:fldCharType="begin"/>
+        </w:r>
+        <w:r>
+          <w:instrText>PAGE   \* MERGEFORMAT</w:instrText>
+        </w:r>
+        <w:r>
+          <w:fldChar w:fldCharType="separate"/>
+        </w:r>
+        <w:r>
+          <w:rPr>
+            <w:lang w:val="fr-FR"/>
+          </w:rPr>
+          <w:t>2</w:t>
+        </w:r>
+        <w:r>
+          <w:fldChar w:fldCharType="end"/>
+        </w:r>
+      </w:p>
+    </w:sdtContent>
+  </w:sdt>
+  <w:p/>
+</w:ftr>
+</file>
+
+<file path=word/footer2.xml><?xml version="1.0" encoding="utf-8"?>
+<w:ftr xmlns:wpc="http://schemas.microsoft.com/office/word/2010/wordprocessingCanvas" xmlns:cx="http://schemas.microsoft.com/office/drawing/2014/chartex" xmlns:cx1="http://schemas.microsoft.com/office/drawing/2015/9/8/chartex" xmlns:cx2="http://schemas.microsoft.com/office/drawing/2015/10/21/chartex" xmlns:cx3="http://schemas.microsoft.com/office/drawing/2016/5/9/chartex" xmlns:cx4="http://schemas.microsoft.com/office/drawing/2016/5/10/chartex" xmlns:cx5="http://schemas.microsoft.com/office/drawing/2016/5/11/chartex" xmlns:cx6="http://schemas.microsoft.com/office/drawing/2016/5/12/chartex" xmlns:cx7="http://schemas.microsoft.com/office/drawing/2016/5/13/chartex" xmlns:cx8="http://schemas.microsoft.com/office/drawing/2016/5/14/chartex" xmlns:mc="http://schemas.openxmlformats.org/markup-compatibility/2006" xmlns:aink="http://schemas.microsoft.com/office/drawing/2016/ink" xmlns:am3d="http://schemas.microsoft.com/office/drawing/2017/model3d" xmlns:o="urn:schemas-microsoft-com:office:office" xmlns:oel="http://schemas.microsoft.com/office/2019/extlst" xmlns:r="http://schemas.openxmlformats.org/officeDocument/2006/relationships" xmlns:m="http://schemas.openxmlformats.org/officeDocument/2006/math" xmlns:v="urn:schemas-microsoft-com:vml" xmlns:wp14="http://schemas.microsoft.com/office/word/2010/wordprocessingDrawing" xmlns:wp="http://schemas.openxmlformats.org/drawingml/2006/wordprocessingDrawing" xmlns:w10="urn:schemas-microsoft-com:office:word" xmlns:w="http://schemas.openxmlformats.org/wordprocessingml/2006/main" xmlns:w14="http://schemas.microsoft.com/office/word/2010/wordml" xmlns:w15="http://schemas.microsoft.com/office/word/2012/wordml" xmlns:w16cex="http://schemas.microsoft.com/office/word/2018/wordml/cex" xmlns:w16cid="http://schemas.microsoft.com/office/word/2016/wordml/cid" xmlns:w16="http://schemas.microsoft.com/office/word/2018/wordml" xmlns:w16du="http://schemas.microsoft.com/office/word/2023/wordml/word16du" xmlns:w16sdtdh="http://schemas.microsoft.com/office/word/2020/wordml/sdtdatahash" xmlns:w16sdtfl="http://schemas.microsoft.com/office/word/2024/wordml/sdtformatlock" xmlns:w16se="http://schemas.microsoft.com/office/word/2015/wordml/symex" xmlns:wpg="http://schemas.microsoft.com/office/word/2010/wordprocessingGroup" xmlns:wpi="http://schemas.microsoft.com/office/word/2010/wordprocessingInk" xmlns:wne="http://schemas.microsoft.com/office/word/2006/wordml" xmlns:wps="http://schemas.microsoft.com/office/word/2010/wordprocessingShape" mc:Ignorable="w14 w15 w16se w16cid w16 w16cex w16sdtdh w16sdtfl w16du wp14">
+  <w:p>
+    <w:pPr>
+      <w:pStyle w:val="Pieddepage"/>
+    </w:pPr>
+    <w:r>
+      <w:t>ODIP Edition 1</w:t>
+    </w:r>
+  </w:p>
+  <w:p>
+    <w:pPr>
+      <w:pStyle w:val="Pieddepage"/>
+    </w:pPr>
+  </w:p>
+</w:ftr>
+</file>
+
+<file path=word/footnotes.xml><?xml version="1.0" encoding="utf-8"?>
+<w:footnotes xmlns:wpc="http://schemas.microsoft.com/office/word/2010/wordprocessingCanvas" xmlns:cx="http://schemas.microsoft.com/office/drawing/2014/chartex" xmlns:cx1="http://schemas.microsoft.com/office/drawing/2015/9/8/chartex" xmlns:cx2="http://schemas.microsoft.com/office/drawing/2015/10/21/chartex" xmlns:cx3="http://schemas.microsoft.com/office/drawing/2016/5/9/chartex" xmlns:cx4="http://schemas.microsoft.com/office/drawing/2016/5/10/chartex" xmlns:cx5="http://schemas.microsoft.com/office/drawing/2016/5/11/chartex" xmlns:cx6="http://schemas.microsoft.com/office/drawing/2016/5/12/chartex" xmlns:cx7="http://schemas.microsoft.com/office/drawing/2016/5/13/chartex" xmlns:cx8="http://schemas.microsoft.com/office/drawing/2016/5/14/chartex" xmlns:mc="http://schemas.openxmlformats.org/markup-compatibility/2006" xmlns:aink="http://schemas.microsoft.com/office/drawing/2016/ink" xmlns:am3d="http://schemas.microsoft.com/office/drawing/2017/model3d" xmlns:o="urn:schemas-microsoft-com:office:office" xmlns:oel="http://schemas.microsoft.com/office/2019/extlst" xmlns:r="http://schemas.openxmlformats.org/officeDocument/2006/relationships" xmlns:m="http://schemas.openxmlformats.org/officeDocument/2006/math" xmlns:v="urn:schemas-microsoft-com:vml" xmlns:wp14="http://schemas.microsoft.com/office/word/2010/wordprocessingDrawing" xmlns:wp="http://schemas.openxmlformats.org/drawingml/2006/wordprocessingDrawing" xmlns:w10="urn:schemas-microsoft-com:office:word" xmlns:w="http://schemas.openxmlformats.org/wordprocessingml/2006/main" xmlns:w14="http://schemas.microsoft.com/office/word/2010/wordml" xmlns:w15="http://schemas.microsoft.com/office/word/2012/wordml" xmlns:w16cex="http://schemas.microsoft.com/office/word/2018/wordml/cex" xmlns:w16cid="http://schemas.microsoft.com/office/word/2016/wordml/cid" xmlns:w16="http://schemas.microsoft.com/office/word/2018/wordml" xmlns:w16du="http://schemas.microsoft.com/office/word/2023/wordml/word16du" xmlns:w16sdtdh="http://schemas.microsoft.com/office/word/2020/wordml/sdtdatahash" xmlns:w16sdtfl="http://schemas.microsoft.com/office/word/2024/wordml/sdtformatlock" xmlns:w16se="http://schemas.microsoft.com/office/word/2015/wordml/symex" xmlns:wpg="http://schemas.microsoft.com/office/word/2010/wordprocessingGroup" xmlns:wpi="http://schemas.microsoft.com/office/word/2010/wordprocessingInk" xmlns:wne="http://schemas.microsoft.com/office/word/2006/wordml" xmlns:wps="http://schemas.microsoft.com/office/word/2010/wordprocessingShape" mc:Ignorable="w14 w15 w16se w16cid w16 w16cex w16sdtdh w16sdtfl w16du wp14">
+  <w:footnote w:type="separator" w:id="-1">
+    <w:p>
+      <w:r>
+        <w:separator/>
+      </w:r>
+    </w:p>
+  </w:footnote>
+  <w:footnote w:type="continuationSeparator" w:id="0">
+    <w:p>
+      <w:r>
+        <w:continuationSeparator/>
+      </w:r>
+    </w:p>
+  </w:footnote>
+</w:footnotes>
 </file>
 
 <file path=word/numbering.xml><?xml version="1.0" encoding="utf-8"?>
@@ -130,11 +265,7 @@
         <w14:ligatures w14:val="standardContextual"/>
       </w:rPr>
     </w:rPrDefault>
-    <w:pPrDefault>
-      <w:pPr>
-        <w:spacing w:after="160" w:line="259" w:lineRule="auto"/>
-      </w:pPr>
-    </w:pPrDefault>
+    <w:pPrDefault/>
   </w:docDefaults>
   <w:latentStyles w:defLockedState="0" w:defUIPriority="99" w:defSemiHidden="0" w:defUnhideWhenUsed="0" w:defQFormat="0" w:count="376">
     <w:lsdException w:name="Normal" w:uiPriority="0" w:qFormat="1"/>
@@ -660,7 +791,7 @@
         <w:ilvl w:val="5"/>
         <w:numId w:val="1"/>
       </w:numPr>
-      <w:spacing w:before="40" w:after="0"/>
+      <w:spacing w:before="40"/>
       <w:outlineLvl w:val="5"/>
     </w:pPr>
     <w:rPr>
@@ -686,7 +817,7 @@
         <w:ilvl w:val="6"/>
         <w:numId w:val="1"/>
       </w:numPr>
-      <w:spacing w:before="40" w:after="0"/>
+      <w:spacing w:before="40"/>
       <w:outlineLvl w:val="6"/>
     </w:pPr>
     <w:rPr>
@@ -711,7 +842,6 @@
         <w:ilvl w:val="7"/>
         <w:numId w:val="1"/>
       </w:numPr>
-      <w:spacing w:after="0"/>
       <w:outlineLvl w:val="7"/>
     </w:pPr>
     <w:rPr>
@@ -738,7 +868,6 @@
         <w:ilvl w:val="8"/>
         <w:numId w:val="1"/>
       </w:numPr>
-      <w:spacing w:after="0"/>
       <w:outlineLvl w:val="8"/>
     </w:pPr>
     <w:rPr>
@@ -895,7 +1024,7 @@
     <w:qFormat/>
     <w:rsid w:val="00367345"/>
     <w:pPr>
-      <w:spacing w:after="80" w:line="240" w:lineRule="auto"/>
+      <w:spacing w:after="80"/>
       <w:contextualSpacing/>
     </w:pPr>
     <w:rPr>
@@ -1064,6 +1193,74 @@
     <w:semiHidden/>
     <w:unhideWhenUsed/>
     <w:rsid w:val="003F6EC6"/>
+  </w:style>
+  <w:style w:type="paragraph" w:styleId="Sansinterligne">
+    <w:name w:val="No Spacing"/>
+    <w:link w:val="SansinterligneCar"/>
+    <w:uiPriority w:val="1"/>
+    <w:qFormat/>
+    <w:rsid w:val="000D0C78"/>
+    <w:rPr>
+      <w:rFonts w:eastAsiaTheme="minorEastAsia"/>
+      <w:kern w:val="0"/>
+      <w:lang w:eastAsia="fr-BE"/>
+      <w14:ligatures w14:val="none"/>
+    </w:rPr>
+  </w:style>
+  <w:style w:type="character" w:customStyle="1" w:styleId="SansinterligneCar">
+    <w:name w:val="Sans interligne Car"/>
+    <w:basedOn w:val="Policepardfaut"/>
+    <w:link w:val="Sansinterligne"/>
+    <w:uiPriority w:val="1"/>
+    <w:rsid w:val="000D0C78"/>
+    <w:rPr>
+      <w:rFonts w:eastAsiaTheme="minorEastAsia"/>
+      <w:kern w:val="0"/>
+      <w:lang w:eastAsia="fr-BE"/>
+      <w14:ligatures w14:val="none"/>
+    </w:rPr>
+  </w:style>
+  <w:style w:type="paragraph" w:styleId="En-tte">
+    <w:name w:val="header"/>
+    <w:basedOn w:val="Normal"/>
+    <w:link w:val="En-tteCar"/>
+    <w:uiPriority w:val="99"/>
+    <w:unhideWhenUsed/>
+    <w:rsid w:val="000D0C78"/>
+    <w:pPr>
+      <w:tabs>
+        <w:tab w:val="center" w:pos="4536"/>
+        <w:tab w:val="right" w:pos="9072"/>
+      </w:tabs>
+    </w:pPr>
+  </w:style>
+  <w:style w:type="character" w:customStyle="1" w:styleId="En-tteCar">
+    <w:name w:val="En-tête Car"/>
+    <w:basedOn w:val="Policepardfaut"/>
+    <w:link w:val="En-tte"/>
+    <w:uiPriority w:val="99"/>
+    <w:rsid w:val="000D0C78"/>
+  </w:style>
+  <w:style w:type="paragraph" w:styleId="Pieddepage">
+    <w:name w:val="footer"/>
+    <w:basedOn w:val="Normal"/>
+    <w:link w:val="PieddepageCar"/>
+    <w:uiPriority w:val="99"/>
+    <w:unhideWhenUsed/>
+    <w:rsid w:val="000D0C78"/>
+    <w:pPr>
+      <w:tabs>
+        <w:tab w:val="center" w:pos="4536"/>
+        <w:tab w:val="right" w:pos="9072"/>
+      </w:tabs>
+    </w:pPr>
+  </w:style>
+  <w:style w:type="character" w:customStyle="1" w:styleId="PieddepageCar">
+    <w:name w:val="Pied de page Car"/>
+    <w:basedOn w:val="Policepardfaut"/>
+    <w:link w:val="Pieddepage"/>
+    <w:uiPriority w:val="99"/>
+    <w:rsid w:val="000D0C78"/>
   </w:style>
 </w:styles>
 </file>
@@ -1361,4 +1558,35 @@
     </a:ext>
   </a:extLst>
 </a:theme>
+</file>
+
+<file path=customXml/item1.xml><?xml version="1.0" encoding="utf-8"?>
+<CoverPageProperties xmlns="http://schemas.microsoft.com/office/2006/coverPageProps">
+  <PublishDate>2026-05-18T00:00:00</PublishDate>
+  <Abstract/>
+  <CompanyAddress/>
+  <CompanyPhone/>
+  <CompanyFax/>
+  <CompanyEmail/>
+</CoverPageProperties>
+</file>
+
+<file path=customXml/item2.xml><?xml version="1.0" encoding="utf-8"?>
+<b:Sources xmlns:b="http://schemas.openxmlformats.org/officeDocument/2006/bibliography" xmlns="http://schemas.openxmlformats.org/officeDocument/2006/bibliography" SelectedStyle="\APASixthEditionOfficeOnline.xsl" StyleName="APA" Version="6"/>
+</file>
+
+<file path=customXml/itemProps1.xml><?xml version="1.0" encoding="utf-8"?>
+<ds:datastoreItem xmlns:ds="http://schemas.openxmlformats.org/officeDocument/2006/customXml" ds:itemID="{55AF091B-3C7A-41E3-B477-F2FDAA23CFDA}">
+  <ds:schemaRefs>
+    <ds:schemaRef ds:uri="http://schemas.microsoft.com/office/2006/coverPageProps"/>
+  </ds:schemaRefs>
+</ds:datastoreItem>
+</file>
+
+<file path=customXml/itemProps2.xml><?xml version="1.0" encoding="utf-8"?>
+<ds:datastoreItem xmlns:ds="http://schemas.openxmlformats.org/officeDocument/2006/customXml" ds:itemID="{40A1D71A-99C9-41E6-A1F3-B96016F46D9F}">
+  <ds:schemaRefs>
+    <ds:schemaRef ds:uri="http://schemas.openxmlformats.org/officeDocument/2006/bibliography"/>
+  </ds:schemaRefs>
+</ds:datastoreItem>
 </file>
</xml_diff>